<commit_message>
Omlopp enligt förarnas linjebytesnorm (S↔N, Ö↔V) och OSRM för förslagen
- Omloppen härleds med normen att föraren byter linje Syd↔Norr och
  Öst↔Väst; robusthet redovisas som varv utan ≥ 3 min reglering.
- 1b ryms med alla 20 turer (bytet V→Ö 0,5 min), robust variant 15/20;
  N2 ryms 20/20; paket A, paket A robust och paket B omräknade.
- Sammanslagning omformulerad: reglering vid bytet till partnerlinjen.
- s01_vagdragning ruttar även förslagens nya delsträckor (Möckelö Strand,
  Maxinge–Bo-Bil–Bolstavägen); kartor och GIS använder OSRM-geometri
  när den finns. Bakgrundslagren i QGIS med tydligare namn.
- PM, kapitel 4 och 5, figurer, kalkyl och GIS-lager uppdaterade.

Co-Authored-By: Claude Opus 5.5 <noreply@anthropic.com>
Claude-Session: https://claude.ai/code/session_01WLHtAWyi9yj91UnyPCG2J5
</commit_message>
<xml_diff>
--- a/rapport/PM_linjeforslag.docx
+++ b/rapport/PM_linjeforslag.docx
@@ -203,13 +203,13 @@
         <w:t xml:space="preserve"> </w:t>
       </w:r>
       <w:r>
-        <w:t xml:space="preserve">Förslagen har också sammanställts i två paket. Paket A innehåller 1b, 2 och 3, paket B innehåller 1a,</w:t>
-      </w:r>
-      <w:r>
-        <w:t xml:space="preserve"> </w:t>
-      </w:r>
-      <w:r>
-        <w:t xml:space="preserve">2 och 3.</w:t>
+        <w:t xml:space="preserve">Omloppen följer förarnas norm att byta linje i centrum, Syd ↔ Norr (S ↔ N) och Öst ↔ Väst (Ö ↔ V). Förslagen</w:t>
+      </w:r>
+      <w:r>
+        <w:t xml:space="preserve"> </w:t>
+      </w:r>
+      <w:r>
+        <w:t xml:space="preserve">har också sammanställts i två paket: paket A med 1b, 2 och 3, och paket B med 1a, 2 och 3.</w:t>
       </w:r>
     </w:p>
     <w:p>
@@ -217,13 +217,13 @@
         <w:pStyle w:val="BodyText"/>
       </w:pPr>
       <w:r>
-        <w:t xml:space="preserve">Stadstrafiken körs i dag med fem bussar i en gemensam puls i centrum. Marginalerna är små: linje V har bara</w:t>
-      </w:r>
-      <w:r>
-        <w:t xml:space="preserve"> </w:t>
-      </w:r>
-      <w:r>
-        <w:t xml:space="preserve">3 minuters vändtid.</w:t>
+        <w:t xml:space="preserve">Stadstrafiken körs i dag med fem bussar. Två bussar växlar mellan S och N, två mellan V och Ö, och en kör</w:t>
+      </w:r>
+      <w:r>
+        <w:t xml:space="preserve"> </w:t>
+      </w:r>
+      <w:r>
+        <w:t xml:space="preserve">linje J. Marginalerna är små: bussen har 3 minuter vid bytet V → Ö och 7 minuter vid bytet Ö → V.</w:t>
       </w:r>
     </w:p>
     <w:p>
@@ -261,13 +261,13 @@
           <w:b/>
           <w:bCs/>
         </w:rPr>
-        <w:t xml:space="preserve">220 000 euro per år</w:t>
-      </w:r>
-      <w:r>
-        <w:t xml:space="preserve"> </w:t>
-      </w:r>
-      <w:r>
-        <w:t xml:space="preserve">(175 000–260 000). Utan extra buss</w:t>
+        <w:t xml:space="preserve">216 000 euro per år</w:t>
+      </w:r>
+      <w:r>
+        <w:t xml:space="preserve"> </w:t>
+      </w:r>
+      <w:r>
+        <w:t xml:space="preserve">(176 000–259 000). Utan extra buss</w:t>
       </w:r>
       <w:r>
         <w:t xml:space="preserve"> </w:t>
@@ -295,41 +295,25 @@
         <w:t xml:space="preserve"> </w:t>
       </w:r>
       <w:r>
-        <w:t xml:space="preserve">omvägen tar 2,5 minuter per tur. Förslaget ryms med alla turer om linje</w:t>
-      </w:r>
-      <w:r>
-        <w:t xml:space="preserve"> </w:t>
-      </w:r>
-      <w:r>
-        <w:t xml:space="preserve">V och Ö</w:t>
-      </w:r>
-      <w:r>
-        <w:t xml:space="preserve"> </w:t>
-      </w:r>
-      <w:r>
-        <w:rPr>
-          <w:b/>
-          <w:bCs/>
-        </w:rPr>
-        <w:t xml:space="preserve">slås ihop till en genomgående linje V/Ö</w:t>
-      </w:r>
-      <w:r>
-        <w:t xml:space="preserve"> </w:t>
-      </w:r>
-      <w:r>
-        <w:t xml:space="preserve">i centrum. Bussen fortsätter då direkt från V till Ö,</w:t>
-      </w:r>
-      <w:r>
-        <w:t xml:space="preserve"> </w:t>
-      </w:r>
-      <w:r>
-        <w:t xml:space="preserve">och regleringen tas en gång per varv. Driftkostnaden ökar med cirka 4 000 euro per år, enbart genom fler</w:t>
-      </w:r>
-      <w:r>
-        <w:t xml:space="preserve"> </w:t>
-      </w:r>
-      <w:r>
-        <w:t xml:space="preserve">kilometer.</w:t>
+        <w:t xml:space="preserve">omvägen tar 2,5 minuter per tur. Förslaget ryms med alla 20 turer.</w:t>
+      </w:r>
+      <w:r>
+        <w:t xml:space="preserve"> </w:t>
+      </w:r>
+      <w:r>
+        <w:t xml:space="preserve">Bytet V → Ö blir 0,5 minut, och regleringen tas vid bytet Ö → V. Kring Ö:s skolturer blir regleringen då</w:t>
+      </w:r>
+      <w:r>
+        <w:t xml:space="preserve"> </w:t>
+      </w:r>
+      <w:r>
+        <w:t xml:space="preserve">kortare än 3 minuter per varv. En robust variant trafikerar Möckelö Strand med 15 av 20 turer.</w:t>
+      </w:r>
+      <w:r>
+        <w:t xml:space="preserve"> </w:t>
+      </w:r>
+      <w:r>
+        <w:t xml:space="preserve">Driftkostnaden ökar med cirka 4 600 euro per år, enbart genom fler kilometer.</w:t>
       </w:r>
     </w:p>
     <w:p>
@@ -351,7 +335,7 @@
         <w:t xml:space="preserve"> </w:t>
       </w:r>
       <w:r>
-        <w:t xml:space="preserve">hållplatsen ryms på 19 av 20 turer och ger 55 invånare en hållplats inom 400 m.</w:t>
+        <w:t xml:space="preserve">hållplatsen ryms med alla 20 turer och ger 55 invånare en hållplats inom 400 m.</w:t>
       </w:r>
     </w:p>
     <w:p>
@@ -409,13 +393,13 @@
         <w:t xml:space="preserve"> </w:t>
       </w:r>
       <w:r>
-        <w:t xml:space="preserve">driftkostnad som är praktiskt taget oförändrad. Andelen invånare med hållplats inom 400 m ökar från 83,6 %</w:t>
-      </w:r>
-      <w:r>
-        <w:t xml:space="preserve"> </w:t>
-      </w:r>
-      <w:r>
-        <w:t xml:space="preserve">till 85,0 %. Paket B ger samma täckning men kräver en sjätte buss.</w:t>
+        <w:t xml:space="preserve">driftkostnad som är praktiskt taget oförändrad (+2 300 euro per år). Andelen invånare med hållplats inom</w:t>
+      </w:r>
+      <w:r>
+        <w:t xml:space="preserve"> </w:t>
+      </w:r>
+      <w:r>
+        <w:t xml:space="preserve">400 m ökar från 83,6 % till 85,0 %. Paket B ger samma täckning men kräver en sjätte buss.</w:t>
       </w:r>
     </w:p>
     <w:p>
@@ -429,7 +413,7 @@
         <w:t xml:space="preserve"> </w:t>
       </w:r>
       <w:r>
-        <w:t xml:space="preserve">motsvarar den sparade merkostnaden för 1a ett nuvärde på 2,5–3,6 miljoner euro över 20 år.</w:t>
+        <w:t xml:space="preserve">motsvarar den sparade merkostnaden för 1a ett nuvärde på 2,4–3,6 miljoner euro över 20 år.</w:t>
       </w:r>
       <w:r>
         <w:t xml:space="preserve"> </w:t>
@@ -456,7 +440,13 @@
         <w:t xml:space="preserve">rekommenderas för fortsatt utformning</w:t>
       </w:r>
       <w:r>
-        <w:t xml:space="preserve">, under förutsättning att vägen byggs.</w:t>
+        <w:t xml:space="preserve">, under förutsättning att vägen byggs. Börja med den robusta</w:t>
+      </w:r>
+      <w:r>
+        <w:t xml:space="preserve"> </w:t>
+      </w:r>
+      <w:r>
+        <w:t xml:space="preserve">varianten tills körtiderna kring Ö:s skolturer har stämts av.</w:t>
       </w:r>
     </w:p>
     <w:bookmarkEnd w:id="9"/>
@@ -578,7 +568,7 @@
         <w:pStyle w:val="FirstParagraph"/>
       </w:pPr>
       <w:r>
-        <w:t xml:space="preserve">Dessutom skulle två sammanslagna linjer prövas för 1b. För 1a skulle en överslagskalkyl göras, och</w:t>
+        <w:t xml:space="preserve">Dessutom skulle möjligheten att slå ihop linjer prövas för 1b. För 1a skulle en överslagskalkyl göras, och</w:t>
       </w:r>
       <w:r>
         <w:t xml:space="preserve"> </w:t>
@@ -653,7 +643,7 @@
         </w:numPr>
       </w:pPr>
       <w:r>
-        <w:t xml:space="preserve">omloppen byggs om med minsta möjliga antal fordon;</w:t>
+        <w:t xml:space="preserve">omloppen byggs om med minsta möjliga antal fordon och enligt förarnas norm för linjebyten;</w:t>
       </w:r>
     </w:p>
     <w:p>
@@ -665,7 +655,25 @@
         </w:numPr>
       </w:pPr>
       <w:r>
-        <w:t xml:space="preserve">förslaget ryms om antalet bussar inte ökar och omloppstiden ökar med högst 10 minuter per vardag.</w:t>
+        <w:t xml:space="preserve">förslaget ryms om antalet bussar inte ökar och omloppstiden ökar med högst 10 minuter per vardag;</w:t>
+      </w:r>
+    </w:p>
+    <w:p>
+      <w:pPr>
+        <w:pStyle w:val="Compact"/>
+        <w:numPr>
+          <w:ilvl w:val="0"/>
+          <w:numId w:val="1004"/>
+        </w:numPr>
+      </w:pPr>
+      <w:r>
+        <w:t xml:space="preserve">förslaget är robust om det inte ger fler varv med mindre än 3 minuters reglering än i dag. Ett varv är</w:t>
+      </w:r>
+      <w:r>
+        <w:t xml:space="preserve"> </w:t>
+      </w:r>
+      <w:r>
+        <w:t xml:space="preserve">två på varandra följande byten.</w:t>
       </w:r>
     </w:p>
     <w:bookmarkEnd w:id="11"/>
@@ -689,7 +697,7 @@
         <w:t xml:space="preserve"> </w:t>
       </w:r>
       <w:r>
-        <w:t xml:space="preserve">vardag, tisdag 2026-09-01 (figur 1):</w:t>
+        <w:t xml:space="preserve">vardag, tisdag 2026-09-01, med förarnas norm för linjebyten (figur 1):</w:t>
       </w:r>
     </w:p>
     <w:p>
@@ -755,19 +763,19 @@
           <w:b/>
           <w:bCs/>
         </w:rPr>
-        <w:t xml:space="preserve">Vändtid i centrum:</w:t>
-      </w:r>
-      <w:r>
-        <w:t xml:space="preserve"> </w:t>
-      </w:r>
-      <w:r>
-        <w:t xml:space="preserve">linje V har 3 minuter, N 4 minuter, och S och Ö 7 minuter. Efter Ö:s skolturer</w:t>
-      </w:r>
-      <w:r>
-        <w:t xml:space="preserve"> </w:t>
-      </w:r>
-      <w:r>
-        <w:t xml:space="preserve">är vändtiden bara 1–2 minuter.</w:t>
+        <w:t xml:space="preserve">Linjebyten:</w:t>
+      </w:r>
+      <w:r>
+        <w:t xml:space="preserve"> </w:t>
+      </w:r>
+      <w:r>
+        <w:t xml:space="preserve">bussarna byter S → N, N → S, V → Ö och Ö → V. Ingen buss fortsätter på samma linje,</w:t>
+      </w:r>
+      <w:r>
+        <w:t xml:space="preserve"> </w:t>
+      </w:r>
+      <w:r>
+        <w:t xml:space="preserve">utom J.</w:t>
       </w:r>
     </w:p>
     <w:p>
@@ -783,19 +791,19 @@
           <w:b/>
           <w:bCs/>
         </w:rPr>
-        <w:t xml:space="preserve">Marginaler:</w:t>
-      </w:r>
-      <w:r>
-        <w:t xml:space="preserve"> </w:t>
-      </w:r>
-      <w:r>
-        <w:t xml:space="preserve">med krav på 2 minuters lägsta vändtid i stället för dagens 1 minut skulle det behövas en</w:t>
-      </w:r>
-      <w:r>
-        <w:t xml:space="preserve"> </w:t>
-      </w:r>
-      <w:r>
-        <w:t xml:space="preserve">sjätte buss.</w:t>
+        <w:t xml:space="preserve">Bytestider i centrum:</w:t>
+      </w:r>
+      <w:r>
+        <w:t xml:space="preserve"> </w:t>
+      </w:r>
+      <w:r>
+        <w:t xml:space="preserve">V → Ö 3 minuter, Ö → V 7 minuter, S → N 7 minuter och N → S 4 minuter.</w:t>
+      </w:r>
+      <w:r>
+        <w:t xml:space="preserve"> </w:t>
+      </w:r>
+      <w:r>
+        <w:t xml:space="preserve">Efter Ö:s skolturer är bytestiden 1–2 minuter.</w:t>
       </w:r>
     </w:p>
     <w:p>
@@ -811,19 +819,19 @@
           <w:b/>
           <w:bCs/>
         </w:rPr>
-        <w:t xml:space="preserve">Kvällstrafik:</w:t>
-      </w:r>
-      <w:r>
-        <w:t xml:space="preserve"> </w:t>
-      </w:r>
-      <w:r>
-        <w:t xml:space="preserve">den är redan i dag upplagd så att ett fordon växlar mellan V och Ö och ett annat mellan</w:t>
-      </w:r>
-      <w:r>
-        <w:t xml:space="preserve"> </w:t>
-      </w:r>
-      <w:r>
-        <w:t xml:space="preserve">N och S.</w:t>
+        <w:t xml:space="preserve">Marginaler:</w:t>
+      </w:r>
+      <w:r>
+        <w:t xml:space="preserve"> </w:t>
+      </w:r>
+      <w:r>
+        <w:t xml:space="preserve">med krav på 2 minuters lägsta vändtid i stället för dagens 1 minut skulle det behövas en</w:t>
+      </w:r>
+      <w:r>
+        <w:t xml:space="preserve"> </w:t>
+      </w:r>
+      <w:r>
+        <w:t xml:space="preserve">sjätte buss. I dag finns ett varv med mindre än 3 minuters reglering (linje J 13:17–15:20).</w:t>
       </w:r>
     </w:p>
     <w:p>
@@ -1028,13 +1036,19 @@
         <w:t xml:space="preserve"> </w:t>
       </w:r>
       <w:r>
-        <w:t xml:space="preserve">linjerna redovisas som raka streck mellan hållplatserna, eftersom vägdragning från OSRM inte</w:t>
-      </w:r>
-      <w:r>
-        <w:t xml:space="preserve"> </w:t>
-      </w:r>
-      <w:r>
-        <w:t xml:space="preserve">kunde hämtas.</w:t>
+        <w:t xml:space="preserve">analysen och kartorna är förberedda för linjernas vägdragning längs gatunätet (OSRM),</w:t>
+      </w:r>
+      <w:r>
+        <w:t xml:space="preserve"> </w:t>
+      </w:r>
+      <w:r>
+        <w:t xml:space="preserve">inklusive förslagens nya delsträckor. OSRM kunde inte nås från analysmiljön, så i den här versionen är</w:t>
+      </w:r>
+      <w:r>
+        <w:t xml:space="preserve"> </w:t>
+      </w:r>
+      <w:r>
+        <w:t xml:space="preserve">linjerna ritade som raka streck mellan hållplatserna.</w:t>
       </w:r>
     </w:p>
     <w:bookmarkEnd w:id="16"/>
@@ -1186,7 +1200,7 @@
               <w:pStyle w:val="Compact"/>
             </w:pPr>
             <w:r>
-              <w:t xml:space="preserve">+217 000 € (alla turer)</w:t>
+              <w:t xml:space="preserve">+216 000 € (alla turer)</w:t>
             </w:r>
           </w:p>
         </w:tc>
@@ -1221,7 +1235,7 @@
               <w:pStyle w:val="Compact"/>
             </w:pPr>
             <w:r>
-              <w:t xml:space="preserve">Ja, med genomgående linje V/Ö</w:t>
+              <w:t xml:space="preserve">Ja, 20 av 20. Robust variant: 15 av 20.</w:t>
             </w:r>
           </w:p>
         </w:tc>
@@ -1243,7 +1257,7 @@
               <w:pStyle w:val="Compact"/>
             </w:pPr>
             <w:r>
-              <w:t xml:space="preserve">+4 000 €</w:t>
+              <w:t xml:space="preserve">+4 600 €</w:t>
             </w:r>
           </w:p>
         </w:tc>
@@ -1278,7 +1292,7 @@
               <w:pStyle w:val="Compact"/>
             </w:pPr>
             <w:r>
-              <w:t xml:space="preserve">Ja, 19 av 20 turer</w:t>
+              <w:t xml:space="preserve">Ja, 20 av 20</w:t>
             </w:r>
           </w:p>
         </w:tc>
@@ -1417,25 +1431,25 @@
         <w:t xml:space="preserve"> </w:t>
       </w:r>
       <w:r>
-        <w:t xml:space="preserve">Tillägget är större än linje V:s vändtid på 3 minuter och större än det utrymme en genomgående</w:t>
-      </w:r>
-      <w:r>
-        <w:t xml:space="preserve"> </w:t>
-      </w:r>
-      <w:r>
-        <w:t xml:space="preserve">linje ger (2,5 minuter). Med alla 20 turer krävs en sjätte buss, och omloppstiden ökar med 11,6 timmar per</w:t>
-      </w:r>
-      <w:r>
-        <w:t xml:space="preserve"> </w:t>
-      </w:r>
-      <w:r>
-        <w:t xml:space="preserve">vardag (figur 3). Utan extra buss ryms 8 av 20 turer, men de går på oregelbundna tider: 07:20, 09:50, 10:20,</w:t>
-      </w:r>
-      <w:r>
-        <w:t xml:space="preserve"> </w:t>
-      </w:r>
-      <w:r>
-        <w:t xml:space="preserve">13:10, 13:40, 15:40, 16:40 och 17:40.</w:t>
+        <w:t xml:space="preserve">Tillägget är större än bytestiden V → Ö (3 minuter) och större än det utrymme som finns om all</w:t>
+      </w:r>
+      <w:r>
+        <w:t xml:space="preserve"> </w:t>
+      </w:r>
+      <w:r>
+        <w:t xml:space="preserve">reglering läggs vid bytet Ö → V (2,5 minuter). Med alla 20 turer krävs en sjätte buss, och omloppstiden</w:t>
+      </w:r>
+      <w:r>
+        <w:t xml:space="preserve"> </w:t>
+      </w:r>
+      <w:r>
+        <w:t xml:space="preserve">ökar med 11,6 timmar per vardag (figur 3). Utan extra buss ryms 8 av 20 turer, men de går på oregelbundna</w:t>
+      </w:r>
+      <w:r>
+        <w:t xml:space="preserve"> </w:t>
+      </w:r>
+      <w:r>
+        <w:t xml:space="preserve">tider: 07:20, 09:50, 10:20, 13:10, 13:40, 15:40, 16:40 och 17:40.</w:t>
       </w:r>
     </w:p>
     <w:p>
@@ -1483,7 +1497,7 @@
         </w:numPr>
       </w:pPr>
       <w:r>
-        <w:t xml:space="preserve">Genomresande på linje V får cirka 6,5 minuter längre restid.</w:t>
+        <w:t xml:space="preserve">Genomresande på linje V får 6,5 minuter längre restid.</w:t>
       </w:r>
     </w:p>
     <w:p>
@@ -1505,13 +1519,13 @@
       </w:r>
     </w:p>
     <w:bookmarkEnd w:id="18"/>
-    <w:bookmarkStart w:id="28" w:name="Xa069255ba45ccc293975bb748ce72ae44a450fc"/>
+    <w:bookmarkStart w:id="28" w:name="X0398db1c2b8b5bd4a5f2973578b4413afc2a6f6"/>
     <w:p>
       <w:pPr>
         <w:pStyle w:val="Heading3"/>
       </w:pPr>
       <w:r>
-        <w:t xml:space="preserve">3.2 Förslag 1b – Möckelö Strand via förlängd Norrgårdsvägen och genomgående linje V/Ö</w:t>
+        <w:t xml:space="preserve">3.2 Förslag 1b – Möckelö Strand via förlängd Norrgårdsvägen</w:t>
       </w:r>
     </w:p>
     <w:p>
@@ -1547,43 +1561,19 @@
           <w:b/>
           <w:bCs/>
         </w:rPr>
-        <w:t xml:space="preserve">Omlopp med linje V ensam.</w:t>
-      </w:r>
-      <w:r>
-        <w:t xml:space="preserve"> </w:t>
-      </w:r>
-      <w:r>
-        <w:t xml:space="preserve">Förslaget ryms inte: vändtiden i centrum skulle krympa från 3 till</w:t>
-      </w:r>
-      <w:r>
-        <w:t xml:space="preserve"> </w:t>
-      </w:r>
-      <w:r>
-        <w:t xml:space="preserve">0,5 minut, och med alla turer krävs en sjätte buss.</w:t>
-      </w:r>
-    </w:p>
-    <w:p>
-      <w:pPr>
-        <w:pStyle w:val="BodyText"/>
-      </w:pPr>
-      <w:r>
-        <w:rPr>
-          <w:b/>
-          <w:bCs/>
-        </w:rPr>
-        <w:t xml:space="preserve">Sammanslagning till genomgående linje V/Ö.</w:t>
-      </w:r>
-      <w:r>
-        <w:t xml:space="preserve"> </w:t>
-      </w:r>
-      <w:r>
-        <w:t xml:space="preserve">Linje V och Ö slås ihop i centrum (figur 4). Varvet ser ut så</w:t>
-      </w:r>
-      <w:r>
-        <w:t xml:space="preserve"> </w:t>
-      </w:r>
-      <w:r>
-        <w:t xml:space="preserve">här:</w:t>
+        <w:t xml:space="preserve">Sammanslagning – omloppsparet V ↔ Ö.</w:t>
+      </w:r>
+      <w:r>
+        <w:t xml:space="preserve"> </w:t>
+      </w:r>
+      <w:r>
+        <w:t xml:space="preserve">Bussen som kör linje V fortsätter redan i dag som linje Ö. Med 1b</w:t>
+      </w:r>
+      <w:r>
+        <w:t xml:space="preserve"> </w:t>
+      </w:r>
+      <w:r>
+        <w:t xml:space="preserve">läggs regleringen vid bytet Ö → V i stället för vid båda bytena. Varvet ser då ut så här (figur 4):</w:t>
       </w:r>
     </w:p>
     <w:p>
@@ -1607,7 +1597,7 @@
         </w:numPr>
       </w:pPr>
       <w:r>
-        <w:t xml:space="preserve">Efter ett uppehåll på 0,5 minut i centrum fortsätter den :50 som linje Ö.</w:t>
+        <w:t xml:space="preserve">Efter ett byte på 0,5 minut i centrum fortsätter den :50 som linje Ö.</w:t>
       </w:r>
     </w:p>
     <w:p>
@@ -1633,13 +1623,7 @@
         <w:t xml:space="preserve"> </w:t>
       </w:r>
       <w:r>
-        <w:t xml:space="preserve">avgår i pulsen. Linje V och Ö avgår redan från samma hållplatsläge i centrum, och kvällstrafiken växlar redan</w:t>
-      </w:r>
-      <w:r>
-        <w:t xml:space="preserve"> </w:t>
-      </w:r>
-      <w:r>
-        <w:t xml:space="preserve">mellan dem.</w:t>
+        <w:t xml:space="preserve">avgår i pulsen. Om bytet dessutom skyltas som en genomgående linje kan resenärerna sitta kvar på bussen.</w:t>
       </w:r>
     </w:p>
     <w:p>
@@ -1661,13 +1645,7 @@
         <w:t xml:space="preserve"> </w:t>
       </w:r>
       <w:r>
-        <w:t xml:space="preserve">med genomgående V/Ö ryms alla 20 turer med fem bussar. Omloppstiden ökar med 2–3 minuter per</w:t>
-      </w:r>
-      <w:r>
-        <w:t xml:space="preserve"> </w:t>
-      </w:r>
-      <w:r>
-        <w:t xml:space="preserve">vardag, eftersom dagens sista tur blir längre.</w:t>
+        <w:t xml:space="preserve">alla 20 turer ryms med fem bussar (figur 3). Omloppstiden ökar med 3 minuter per vardag.</w:t>
       </w:r>
     </w:p>
     <w:p>
@@ -1689,13 +1667,19 @@
         <w:t xml:space="preserve"> </w:t>
       </w:r>
       <w:r>
-        <w:t xml:space="preserve">under Ö:s skolturer 13:10–15:10 är regleringen bara 1,5–2 minuter per varv. Det behöver</w:t>
-      </w:r>
-      <w:r>
-        <w:t xml:space="preserve"> </w:t>
-      </w:r>
-      <w:r>
-        <w:t xml:space="preserve">kontrolleras mot verkliga körtider.</w:t>
+        <w:t xml:space="preserve">kring Ö:s skolturer (07:50–08:50 och 13:40–15:40) blir regleringen kortare än 3 minuter per</w:t>
+      </w:r>
+      <w:r>
+        <w:t xml:space="preserve"> </w:t>
+      </w:r>
+      <w:r>
+        <w:t xml:space="preserve">varv, totalt 8 varv mot 1 i dag. En robust variant kör inte omvägen på V-turerna 07:50, 08:50, 13:40,</w:t>
+      </w:r>
+      <w:r>
+        <w:t xml:space="preserve"> </w:t>
+      </w:r>
+      <w:r>
+        <w:t xml:space="preserve">14:40 och 15:40. Hållplatsen får då 15 avgångar per vardag.</w:t>
       </w:r>
     </w:p>
     <w:p>
@@ -1719,7 +1703,7 @@
         </w:numPr>
       </w:pPr>
       <w:r>
-        <w:t xml:space="preserve">179 invånare får en hållplats med 20 avgångar per vardag.</w:t>
+        <w:t xml:space="preserve">179 invånare får en hållplats med 15–20 avgångar per vardag.</w:t>
       </w:r>
     </w:p>
     <w:p>
@@ -1731,24 +1715,6 @@
         </w:numPr>
       </w:pPr>
       <w:r>
-        <w:t xml:space="preserve">Resor mellan linje V:s och Ö:s områden kan göras utan byte i centrum, cirka 0,5 resa per vardag i</w:t>
-      </w:r>
-      <w:r>
-        <w:t xml:space="preserve"> </w:t>
-      </w:r>
-      <w:r>
-        <w:t xml:space="preserve">sommardata.</w:t>
-      </w:r>
-    </w:p>
-    <w:p>
-      <w:pPr>
-        <w:pStyle w:val="Compact"/>
-        <w:numPr>
-          <w:ilvl w:val="0"/>
-          <w:numId w:val="1010"/>
-        </w:numPr>
-      </w:pPr>
-      <w:r>
         <w:t xml:space="preserve">Fordonskilometrarna ökar med cirka 17 km per vardag.</w:t>
       </w:r>
     </w:p>
@@ -1759,7 +1725,7 @@
       <w:r>
         <w:drawing>
           <wp:inline>
-            <wp:extent cx="5334000" cy="4038303"/>
+            <wp:extent cx="5334000" cy="3924855"/>
             <wp:effectExtent b="0" l="0" r="0" t="0"/>
             <wp:docPr descr="Förslag 1, Möckelö Strand" title="" id="20" name="Picture"/>
             <a:graphic>
@@ -1780,7 +1746,7 @@
                   <pic:spPr bwMode="auto">
                     <a:xfrm>
                       <a:off x="0" y="0"/>
-                      <a:ext cx="5334000" cy="4038303"/>
+                      <a:ext cx="5334000" cy="3924855"/>
                     </a:xfrm>
                     <a:prstGeom prst="rect">
                       <a:avLst/>
@@ -1830,7 +1796,7 @@
           <w:i/>
           <w:iCs/>
         </w:rPr>
-        <w:t xml:space="preserve">är schematisk.</w:t>
+        <w:t xml:space="preserve">är schematisk tills vägdragningen har hämtats.</w:t>
       </w:r>
     </w:p>
     <w:p>
@@ -1923,7 +1889,7 @@
           <wp:inline>
             <wp:extent cx="5334000" cy="3824788"/>
             <wp:effectExtent b="0" l="0" r="0" t="0"/>
-            <wp:docPr descr="Genomgående linje V/Ö" title="" id="26" name="Picture"/>
+            <wp:docPr descr="Omloppsparet V och Ö" title="" id="26" name="Picture"/>
             <a:graphic>
               <a:graphicData uri="http://schemas.openxmlformats.org/drawingml/2006/picture">
                 <pic:pic>
@@ -1966,7 +1932,7 @@
         <w:pStyle w:val="ImageCaption"/>
       </w:pPr>
       <w:r>
-        <w:t xml:space="preserve">Genomgående linje V/Ö</w:t>
+        <w:t xml:space="preserve">Omloppsparet V och Ö</w:t>
       </w:r>
     </w:p>
     <w:p>
@@ -1978,7 +1944,7 @@
           <w:i/>
           <w:iCs/>
         </w:rPr>
-        <w:t xml:space="preserve">Figur 4. Genomgående linje V/Ö med Möckelö Strand (1b) och N2 (2).</w:t>
+        <w:t xml:space="preserve">Figur 4. Omloppsparet V ↔ Ö med Möckelö Strand (1b) och N2 (2).</w:t>
       </w:r>
     </w:p>
     <w:bookmarkEnd w:id="28"/>
@@ -2030,19 +1996,13 @@
         <w:t xml:space="preserve"> </w:t>
       </w:r>
       <w:r>
-        <w:t xml:space="preserve">19 av 20 turer ryms. Undantaget är skolturen 08:20, som kommer tillbaka till centrum 08:49 och</w:t>
-      </w:r>
-      <w:r>
-        <w:t xml:space="preserve"> </w:t>
-      </w:r>
-      <w:r>
-        <w:t xml:space="preserve">fortsätter 08:50 (figur 6). Den turen kan köra förbi N2, eller trafikera N2 om bussen fortsätter direkt som</w:t>
-      </w:r>
-      <w:r>
-        <w:t xml:space="preserve"> </w:t>
-      </w:r>
-      <w:r>
-        <w:t xml:space="preserve">linje V 08:50.</w:t>
+        <w:t xml:space="preserve">Alla 20 turer ryms, och förslaget är lika robust som i dag (figur 6). Skolturen 08:20 kommer</w:t>
+      </w:r>
+      <w:r>
+        <w:t xml:space="preserve"> </w:t>
+      </w:r>
+      <w:r>
+        <w:t xml:space="preserve">tillbaka 08:49,5 och fortsätter som linje V 08:50 efter ett kort byte.</w:t>
       </w:r>
     </w:p>
     <w:p>
@@ -2066,7 +2026,7 @@
         </w:numPr>
       </w:pPr>
       <w:r>
-        <w:t xml:space="preserve">55 invånare får hållplats inom 400 m med 19 avgångar per vardag.</w:t>
+        <w:t xml:space="preserve">55 invånare får hållplats inom 400 m med 20 avgångar per vardag.</w:t>
       </w:r>
     </w:p>
     <w:p>
@@ -2167,7 +2127,7 @@
       <w:r>
         <w:drawing>
           <wp:inline>
-            <wp:extent cx="5334000" cy="2617250"/>
+            <wp:extent cx="5334000" cy="1866683"/>
             <wp:effectExtent b="0" l="0" r="0" t="0"/>
             <wp:docPr descr="Förslag 2, omlopp" title="" id="33" name="Picture"/>
             <a:graphic>
@@ -2188,7 +2148,7 @@
                   <pic:spPr bwMode="auto">
                     <a:xfrm>
                       <a:off x="0" y="0"/>
-                      <a:ext cx="5334000" cy="2617250"/>
+                      <a:ext cx="5334000" cy="1866683"/>
                     </a:xfrm>
                     <a:prstGeom prst="rect">
                       <a:avLst/>
@@ -2338,7 +2298,7 @@
         <w:t xml:space="preserve"> </w:t>
       </w:r>
       <w:r>
-        <w:t xml:space="preserve">Förslaget ryms med alla 22 turer. Linje N:s vändtid blir 3,9 minuter i stället för 4.</w:t>
+        <w:t xml:space="preserve">Förslaget ryms med alla 22 turer. Bytet N → S blir 3,9 minuter i stället för 4.</w:t>
       </w:r>
     </w:p>
     <w:p>
@@ -2459,7 +2419,7 @@
           <w:i/>
           <w:iCs/>
         </w:rPr>
-        <w:t xml:space="preserve">Figur 7. Förslag 3. Grönt anger bättre och rött sämre tillgänglighet. Körvägarna är schematiska.</w:t>
+        <w:t xml:space="preserve">Figur 7. Förslag 3. Grönt anger bättre och rött sämre tillgänglighet.</w:t>
       </w:r>
     </w:p>
     <w:bookmarkEnd w:id="39"/>
@@ -2478,7 +2438,7 @@
         <w:pStyle w:val="FirstParagraph"/>
       </w:pPr>
       <w:r>
-        <w:t xml:space="preserve">Förslagen har sammanställts i två paket som verifierats mot omloppen tillsammans (figur 8):</w:t>
+        <w:t xml:space="preserve">Förslagen har sammanställts i tre paket som verifierats mot omloppen tillsammans (figur 8):</w:t>
       </w:r>
     </w:p>
     <w:p>
@@ -2500,13 +2460,41 @@
         <w:t xml:space="preserve"> </w:t>
       </w:r>
       <w:r>
-        <w:t xml:space="preserve">1b med genomgående V/Ö, 2 och 3. Paketet ryms med fem bussar. N2 trafikeras av 19 av 20</w:t>
-      </w:r>
-      <w:r>
-        <w:t xml:space="preserve"> </w:t>
-      </w:r>
-      <w:r>
-        <w:t xml:space="preserve">turer, och omloppstiden ökar med 3 minuter per vardag.</w:t>
+        <w:t xml:space="preserve">1b, 2 och 3 med alla turer. Paketet ryms med fem bussar, och omloppstiden ökar med 3 minuter</w:t>
+      </w:r>
+      <w:r>
+        <w:t xml:space="preserve"> </w:t>
+      </w:r>
+      <w:r>
+        <w:t xml:space="preserve">per vardag. Kring Ö:s skolturer blir regleringen kort (8 varv med mindre än 3 minuter, mot 1 i dag).</w:t>
+      </w:r>
+    </w:p>
+    <w:p>
+      <w:pPr>
+        <w:pStyle w:val="Compact"/>
+        <w:numPr>
+          <w:ilvl w:val="0"/>
+          <w:numId w:val="1014"/>
+        </w:numPr>
+      </w:pPr>
+      <w:r>
+        <w:rPr>
+          <w:b/>
+          <w:bCs/>
+        </w:rPr>
+        <w:t xml:space="preserve">Paket A robust:</w:t>
+      </w:r>
+      <w:r>
+        <w:t xml:space="preserve"> </w:t>
+      </w:r>
+      <w:r>
+        <w:t xml:space="preserve">som paket A, men Möckelö Strand trafikeras av 15 av 20 V-turer. Paketet ryms med fem</w:t>
+      </w:r>
+      <w:r>
+        <w:t xml:space="preserve"> </w:t>
+      </w:r>
+      <w:r>
+        <w:t xml:space="preserve">bussar och är lika robust som i dag.</w:t>
       </w:r>
     </w:p>
     <w:p>
@@ -2551,10 +2539,11 @@
         <w:tblLook w:firstRow="1" w:lastRow="0" w:firstColumn="0" w:lastColumn="0" w:noHBand="0" w:noVBand="0" w:val="0020"/>
       </w:tblPr>
       <w:tblGrid>
-        <w:gridCol w:w="1980"/>
-        <w:gridCol w:w="1980"/>
-        <w:gridCol w:w="1980"/>
-        <w:gridCol w:w="1980"/>
+        <w:gridCol w:w="1584"/>
+        <w:gridCol w:w="1584"/>
+        <w:gridCol w:w="1584"/>
+        <w:gridCol w:w="1584"/>
+        <w:gridCol w:w="1584"/>
       </w:tblGrid>
       <w:tr>
         <w:trPr>
@@ -2597,6 +2586,17 @@
               <w:pStyle w:val="Compact"/>
             </w:pPr>
             <w:r>
+              <w:t xml:space="preserve">Paket A robust</w:t>
+            </w:r>
+          </w:p>
+        </w:tc>
+        <w:tc>
+          <w:tcPr/>
+          <w:p>
+            <w:pPr>
+              <w:pStyle w:val="Compact"/>
+            </w:pPr>
+            <w:r>
               <w:t xml:space="preserve">Paket B</w:t>
             </w:r>
           </w:p>
@@ -2643,7 +2643,18 @@
               <w:pStyle w:val="Compact"/>
             </w:pPr>
             <w:r>
-              <w:t xml:space="preserve">85,0 % (+211 inv.)</w:t>
+              <w:t xml:space="preserve">85,0 %</w:t>
+            </w:r>
+          </w:p>
+        </w:tc>
+        <w:tc>
+          <w:tcPr/>
+          <w:p>
+            <w:pPr>
+              <w:pStyle w:val="Compact"/>
+            </w:pPr>
+            <w:r>
+              <w:t xml:space="preserve">85,0 %</w:t>
             </w:r>
           </w:p>
         </w:tc>
@@ -2693,6 +2704,17 @@
             </w:r>
           </w:p>
         </w:tc>
+        <w:tc>
+          <w:tcPr/>
+          <w:p>
+            <w:pPr>
+              <w:pStyle w:val="Compact"/>
+            </w:pPr>
+            <w:r>
+              <w:t xml:space="preserve">82,4 %</w:t>
+            </w:r>
+          </w:p>
+        </w:tc>
       </w:tr>
       <w:tr>
         <w:tc>
@@ -2735,7 +2757,18 @@
               <w:pStyle w:val="Compact"/>
             </w:pPr>
             <w:r>
-              <w:t xml:space="preserve">55,9 % (+43 inv.)</w:t>
+              <w:t xml:space="preserve">55,9 %</w:t>
+            </w:r>
+          </w:p>
+        </w:tc>
+        <w:tc>
+          <w:tcPr/>
+          <w:p>
+            <w:pPr>
+              <w:pStyle w:val="Compact"/>
+            </w:pPr>
+            <w:r>
+              <w:t xml:space="preserve">55,9 %</w:t>
             </w:r>
           </w:p>
         </w:tc>
@@ -2785,6 +2818,17 @@
             </w:r>
           </w:p>
         </w:tc>
+        <w:tc>
+          <w:tcPr/>
+          <w:p>
+            <w:pPr>
+              <w:pStyle w:val="Compact"/>
+            </w:pPr>
+            <w:r>
+              <w:t xml:space="preserve">29,1 %</w:t>
+            </w:r>
+          </w:p>
+        </w:tc>
       </w:tr>
       <w:tr>
         <w:tc>
@@ -2831,6 +2875,17 @@
             </w:r>
           </w:p>
         </w:tc>
+        <w:tc>
+          <w:tcPr/>
+          <w:p>
+            <w:pPr>
+              <w:pStyle w:val="Compact"/>
+            </w:pPr>
+            <w:r>
+              <w:t xml:space="preserve">15,0 %</w:t>
+            </w:r>
+          </w:p>
+        </w:tc>
       </w:tr>
       <w:tr>
         <w:tc>
@@ -2877,6 +2932,17 @@
             </w:r>
           </w:p>
         </w:tc>
+        <w:tc>
+          <w:tcPr/>
+          <w:p>
+            <w:pPr>
+              <w:pStyle w:val="Compact"/>
+            </w:pPr>
+            <w:r>
+              <w:t xml:space="preserve">278 / 24</w:t>
+            </w:r>
+          </w:p>
+        </w:tc>
       </w:tr>
       <w:tr>
         <w:tc>
@@ -2919,6 +2985,17 @@
               <w:pStyle w:val="Compact"/>
             </w:pPr>
             <w:r>
+              <w:t xml:space="preserve">5</w:t>
+            </w:r>
+          </w:p>
+        </w:tc>
+        <w:tc>
+          <w:tcPr/>
+          <w:p>
+            <w:pPr>
+              <w:pStyle w:val="Compact"/>
+            </w:pPr>
+            <w:r>
               <w:t xml:space="preserve">6</w:t>
             </w:r>
           </w:p>
@@ -2954,7 +3031,18 @@
               <w:pStyle w:val="Compact"/>
             </w:pPr>
             <w:r>
-              <w:t xml:space="preserve">61,4</w:t>
+              <w:t xml:space="preserve">61,5</w:t>
+            </w:r>
+          </w:p>
+        </w:tc>
+        <w:tc>
+          <w:tcPr/>
+          <w:p>
+            <w:pPr>
+              <w:pStyle w:val="Compact"/>
+            </w:pPr>
+            <w:r>
+              <w:t xml:space="preserve">61,5</w:t>
             </w:r>
           </w:p>
         </w:tc>
@@ -3011,6 +3099,17 @@
               <w:pStyle w:val="Compact"/>
             </w:pPr>
             <w:r>
+              <w:t xml:space="preserve">1 140</w:t>
+            </w:r>
+          </w:p>
+        </w:tc>
+        <w:tc>
+          <w:tcPr/>
+          <w:p>
+            <w:pPr>
+              <w:pStyle w:val="Compact"/>
+            </w:pPr>
+            <w:r>
               <w:t xml:space="preserve">1 177</w:t>
             </w:r>
           </w:p>
@@ -3024,6 +3123,63 @@
               <w:pStyle w:val="Compact"/>
             </w:pPr>
             <w:r>
+              <w:t xml:space="preserve">Varv med &lt; 3 min reglering</w:t>
+            </w:r>
+          </w:p>
+        </w:tc>
+        <w:tc>
+          <w:tcPr/>
+          <w:p>
+            <w:pPr>
+              <w:pStyle w:val="Compact"/>
+            </w:pPr>
+            <w:r>
+              <w:t xml:space="preserve">1</w:t>
+            </w:r>
+          </w:p>
+        </w:tc>
+        <w:tc>
+          <w:tcPr/>
+          <w:p>
+            <w:pPr>
+              <w:pStyle w:val="Compact"/>
+            </w:pPr>
+            <w:r>
+              <w:t xml:space="preserve">8</w:t>
+            </w:r>
+          </w:p>
+        </w:tc>
+        <w:tc>
+          <w:tcPr/>
+          <w:p>
+            <w:pPr>
+              <w:pStyle w:val="Compact"/>
+            </w:pPr>
+            <w:r>
+              <w:t xml:space="preserve">1</w:t>
+            </w:r>
+          </w:p>
+        </w:tc>
+        <w:tc>
+          <w:tcPr/>
+          <w:p>
+            <w:pPr>
+              <w:pStyle w:val="Compact"/>
+            </w:pPr>
+            <w:r>
+              <w:t xml:space="preserve">1</w:t>
+            </w:r>
+          </w:p>
+        </w:tc>
+      </w:tr>
+      <w:tr>
+        <w:tc>
+          <w:tcPr/>
+          <w:p>
+            <w:pPr>
+              <w:pStyle w:val="Compact"/>
+            </w:pPr>
+            <w:r>
               <w:t xml:space="preserve">Längre restid för befintliga resenärer (resenärsminuter per vardag)</w:t>
             </w:r>
           </w:p>
@@ -3036,6 +3192,17 @@
             </w:pPr>
             <w:r>
               <w:t xml:space="preserve">–</w:t>
+            </w:r>
+          </w:p>
+        </w:tc>
+        <w:tc>
+          <w:tcPr/>
+          <w:p>
+            <w:pPr>
+              <w:pStyle w:val="Compact"/>
+            </w:pPr>
+            <w:r>
+              <w:t xml:space="preserve">9</w:t>
             </w:r>
           </w:p>
         </w:tc>
@@ -3074,7 +3241,7 @@
         <w:t xml:space="preserve"> </w:t>
       </w:r>
       <w:r>
-        <w:t xml:space="preserve">19–20 avgångar per vardag: de flyttar från gruppen</w:t>
+        <w:t xml:space="preserve">15–20 avgångar per vardag: de flyttar från gruppen</w:t>
       </w:r>
       <w:r>
         <w:t xml:space="preserve"> </w:t>
@@ -3117,7 +3284,7 @@
         <w:pStyle w:val="BodyText"/>
       </w:pPr>
       <w:r>
-        <w:t xml:space="preserve">Förlusten för befintliga resenärer är liten, cirka 8 resenärsminuter per vardag för paket A. Den ska vägas</w:t>
+        <w:t xml:space="preserve">Förlusten för befintliga resenärer är liten, under 10 resenärsminuter per vardag för paket A. Den ska vägas</w:t>
       </w:r>
       <w:r>
         <w:t xml:space="preserve"> </w:t>
@@ -3133,7 +3300,7 @@
       <w:r>
         <w:drawing>
           <wp:inline>
-            <wp:extent cx="5334000" cy="2744868"/>
+            <wp:extent cx="5334000" cy="3536532"/>
             <wp:effectExtent b="0" l="0" r="0" t="0"/>
             <wp:docPr descr="Omlopp, förslagspaket" title="" id="42" name="Picture"/>
             <a:graphic>
@@ -3154,7 +3321,7 @@
                   <pic:spPr bwMode="auto">
                     <a:xfrm>
                       <a:off x="0" y="0"/>
-                      <a:ext cx="5334000" cy="2744868"/>
+                      <a:ext cx="5334000" cy="3536532"/>
                     </a:xfrm>
                     <a:prstGeom prst="rect">
                       <a:avLst/>
@@ -3190,7 +3357,7 @@
           <w:i/>
           <w:iCs/>
         </w:rPr>
-        <w:t xml:space="preserve">Figur 8. Omlopp före och efter för paket A och B.</w:t>
+        <w:t xml:space="preserve">Figur 8. Omlopp före och efter för paket A, paket A robust och paket B.</w:t>
       </w:r>
     </w:p>
     <w:p>
@@ -3200,7 +3367,7 @@
       <w:r>
         <w:drawing>
           <wp:inline>
-            <wp:extent cx="5334000" cy="2673579"/>
+            <wp:extent cx="5334000" cy="2683565"/>
             <wp:effectExtent b="0" l="0" r="0" t="0"/>
             <wp:docPr descr="Systemeffekter" title="" id="45" name="Picture"/>
             <a:graphic>
@@ -3221,7 +3388,7 @@
                   <pic:spPr bwMode="auto">
                     <a:xfrm>
                       <a:off x="0" y="0"/>
-                      <a:ext cx="5334000" cy="2673579"/>
+                      <a:ext cx="5334000" cy="2683565"/>
                     </a:xfrm>
                     <a:prstGeom prst="rect">
                       <a:avLst/>
@@ -3640,7 +3807,7 @@
                 <w:b/>
                 <w:bCs/>
               </w:rPr>
-              <w:t xml:space="preserve">+217 000</w:t>
+              <w:t xml:space="preserve">+216 000</w:t>
             </w:r>
             <w:r>
               <w:t xml:space="preserve"> </w:t>
@@ -3657,7 +3824,7 @@
               <w:pStyle w:val="Compact"/>
             </w:pPr>
             <w:r>
-              <w:t xml:space="preserve">1 211 €/år</w:t>
+              <w:t xml:space="preserve">1 209 €/år</w:t>
             </w:r>
           </w:p>
         </w:tc>
@@ -3738,7 +3905,7 @@
               <w:pStyle w:val="Compact"/>
             </w:pPr>
             <w:r>
-              <w:t xml:space="preserve">1b + genomgående V/Ö</w:t>
+              <w:t xml:space="preserve">1b förlängd Norrgårdsvägen</w:t>
             </w:r>
           </w:p>
         </w:tc>
@@ -3760,7 +3927,7 @@
               <w:pStyle w:val="Compact"/>
             </w:pPr>
             <w:r>
-              <w:t xml:space="preserve">+10</w:t>
+              <w:t xml:space="preserve">+12</w:t>
             </w:r>
           </w:p>
         </w:tc>
@@ -3782,18 +3949,18 @@
               <w:pStyle w:val="Compact"/>
             </w:pPr>
             <w:r>
-              <w:t xml:space="preserve">+4 000 (3 500–5 800)</w:t>
-            </w:r>
-          </w:p>
-        </w:tc>
-        <w:tc>
-          <w:tcPr/>
-          <w:p>
-            <w:pPr>
-              <w:pStyle w:val="Compact"/>
-            </w:pPr>
-            <w:r>
-              <w:t xml:space="preserve">25 €/år</w:t>
+              <w:t xml:space="preserve">+4 600 (3 600–6 000)</w:t>
+            </w:r>
+          </w:p>
+        </w:tc>
+        <w:tc>
+          <w:tcPr/>
+          <w:p>
+            <w:pPr>
+              <w:pStyle w:val="Compact"/>
+            </w:pPr>
+            <w:r>
+              <w:t xml:space="preserve">26 €/år</w:t>
             </w:r>
           </w:p>
         </w:tc>
@@ -3990,7 +4157,7 @@
                 <w:b/>
                 <w:bCs/>
               </w:rPr>
-              <w:t xml:space="preserve">+2 000</w:t>
+              <w:t xml:space="preserve">+2 300</w:t>
             </w:r>
             <w:r>
               <w:t xml:space="preserve"> </w:t>
@@ -4008,6 +4175,74 @@
             </w:pPr>
             <w:r>
               <w:t xml:space="preserve">8 €/år</w:t>
+            </w:r>
+          </w:p>
+        </w:tc>
+      </w:tr>
+      <w:tr>
+        <w:tc>
+          <w:tcPr/>
+          <w:p>
+            <w:pPr>
+              <w:pStyle w:val="Compact"/>
+            </w:pPr>
+            <w:r>
+              <w:t xml:space="preserve">Paket A robust</w:t>
+            </w:r>
+          </w:p>
+        </w:tc>
+        <w:tc>
+          <w:tcPr/>
+          <w:p>
+            <w:pPr>
+              <w:pStyle w:val="Compact"/>
+            </w:pPr>
+            <w:r>
+              <w:t xml:space="preserve">0</w:t>
+            </w:r>
+          </w:p>
+        </w:tc>
+        <w:tc>
+          <w:tcPr/>
+          <w:p>
+            <w:pPr>
+              <w:pStyle w:val="Compact"/>
+            </w:pPr>
+            <w:r>
+              <w:t xml:space="preserve">+12</w:t>
+            </w:r>
+          </w:p>
+        </w:tc>
+        <w:tc>
+          <w:tcPr/>
+          <w:p>
+            <w:pPr>
+              <w:pStyle w:val="Compact"/>
+            </w:pPr>
+            <w:r>
+              <w:t xml:space="preserve">+850</w:t>
+            </w:r>
+          </w:p>
+        </w:tc>
+        <w:tc>
+          <w:tcPr/>
+          <w:p>
+            <w:pPr>
+              <w:pStyle w:val="Compact"/>
+            </w:pPr>
+            <w:r>
+              <w:t xml:space="preserve">+1 400 (1 100–1 800)</w:t>
+            </w:r>
+          </w:p>
+        </w:tc>
+        <w:tc>
+          <w:tcPr/>
+          <w:p>
+            <w:pPr>
+              <w:pStyle w:val="Compact"/>
+            </w:pPr>
+            <w:r>
+              <w:t xml:space="preserve">5 €/år</w:t>
             </w:r>
           </w:p>
         </w:tc>
@@ -4068,7 +4303,7 @@
                 <w:b/>
                 <w:bCs/>
               </w:rPr>
-              <w:t xml:space="preserve">+215 000</w:t>
+              <w:t xml:space="preserve">+214 000</w:t>
             </w:r>
             <w:r>
               <w:t xml:space="preserve"> </w:t>
@@ -4085,7 +4320,7 @@
               <w:pStyle w:val="Compact"/>
             </w:pPr>
             <w:r>
-              <w:t xml:space="preserve">772 €/år</w:t>
+              <w:t xml:space="preserve">771 €/år</w:t>
             </w:r>
           </w:p>
         </w:tc>
@@ -4118,7 +4353,7 @@
         <w:t xml:space="preserve"> </w:t>
       </w:r>
       <w:r>
-        <w:t xml:space="preserve">Driftkostnaden blir då cirka 157 000 euro per år, men reserven för fordonsbortfall minskar.</w:t>
+        <w:t xml:space="preserve">Driftkostnaden blir då cirka 156 000 euro per år, men reserven för fordonsbortfall minskar.</w:t>
       </w:r>
     </w:p>
     <w:p>
@@ -4172,7 +4407,7 @@
         <w:t xml:space="preserve"> </w:t>
       </w:r>
       <w:r>
-        <w:t xml:space="preserve">2,5–3,6 miljoner euro. Kostar vägförlängningen mindre än så är den billigare för samhället än att köra 1a med</w:t>
+        <w:t xml:space="preserve">2,4–3,6 miljoner euro. Kostar vägförlängningen mindre än så är den billigare för samhället än att köra 1a med</w:t>
       </w:r>
       <w:r>
         <w:t xml:space="preserve"> </w:t>
@@ -4188,7 +4423,7 @@
       <w:r>
         <w:drawing>
           <wp:inline>
-            <wp:extent cx="5334000" cy="2335012"/>
+            <wp:extent cx="5334000" cy="2291659"/>
             <wp:effectExtent b="0" l="0" r="0" t="0"/>
             <wp:docPr descr="Överslagskalkyl" title="" id="52" name="Picture"/>
             <a:graphic>
@@ -4209,7 +4444,7 @@
                   <pic:spPr bwMode="auto">
                     <a:xfrm>
                       <a:off x="0" y="0"/>
-                      <a:ext cx="5334000" cy="2335012"/>
+                      <a:ext cx="5334000" cy="2291659"/>
                     </a:xfrm>
                     <a:prstGeom prst="rect">
                       <a:avLst/>
@@ -4277,13 +4512,19 @@
         <w:t xml:space="preserve"> </w:t>
       </w:r>
       <w:r>
-        <w:t xml:space="preserve">Ingen linje kan förlängas mer än någon minut på egen hand. Längre förändringar kräver</w:t>
-      </w:r>
-      <w:r>
-        <w:t xml:space="preserve"> </w:t>
-      </w:r>
-      <w:r>
-        <w:t xml:space="preserve">att två linjer slås ihop till en genomgående linje, så att regleringen bara tas en gång per varv.</w:t>
+        <w:t xml:space="preserve">Ingen linje kan förlängas mer än någon minut om varje byte ska ha full reglering.</w:t>
+      </w:r>
+      <w:r>
+        <w:t xml:space="preserve"> </w:t>
+      </w:r>
+      <w:r>
+        <w:t xml:space="preserve">Eftersom bussarna redan växlar i paren S ↔ N och V ↔ Ö kan regleringen läggas vid det ena bytet i varvet.</w:t>
+      </w:r>
+      <w:r>
+        <w:t xml:space="preserve"> </w:t>
+      </w:r>
+      <w:r>
+        <w:t xml:space="preserve">Då frigörs upp till 2,5 minuter per tur för den andra linjen.</w:t>
       </w:r>
     </w:p>
     <w:p>
@@ -4305,19 +4546,19 @@
         <w:t xml:space="preserve"> </w:t>
       </w:r>
       <w:r>
-        <w:t xml:space="preserve">bör trafikeras enligt 1b. Det förutsätter att Norrgårdsvägen förlängs och att linje V</w:t>
-      </w:r>
-      <w:r>
-        <w:t xml:space="preserve"> </w:t>
-      </w:r>
-      <w:r>
-        <w:t xml:space="preserve">och Ö körs som genomgående linje i centrum. Variant 1a ryms inte och kostar cirka 220 000 euro per år.</w:t>
-      </w:r>
-      <w:r>
-        <w:t xml:space="preserve"> </w:t>
-      </w:r>
-      <w:r>
-        <w:t xml:space="preserve">Ett utbud med bara 8 turer på oregelbundna tider rekommenderas inte.</w:t>
+        <w:t xml:space="preserve">bör trafikeras enligt 1b. Det förutsätter att Norrgårdsvägen förlängs. Variant 1a</w:t>
+      </w:r>
+      <w:r>
+        <w:t xml:space="preserve"> </w:t>
+      </w:r>
+      <w:r>
+        <w:t xml:space="preserve">ryms inte och kostar cirka 216 000 euro per år. Ett utbud med bara 8 turer på oregelbundna tider</w:t>
+      </w:r>
+      <w:r>
+        <w:t xml:space="preserve"> </w:t>
+      </w:r>
+      <w:r>
+        <w:t xml:space="preserve">rekommenderas inte.</w:t>
       </w:r>
     </w:p>
     <w:p>
@@ -4333,19 +4574,19 @@
           <w:b/>
           <w:bCs/>
         </w:rPr>
-        <w:t xml:space="preserve">N2 på linje Ö</w:t>
-      </w:r>
-      <w:r>
-        <w:t xml:space="preserve"> </w:t>
-      </w:r>
-      <w:r>
-        <w:t xml:space="preserve">rekommenderas. Skolturen 08:20 kör förbi N2, eller trafikerar den genom att bussen</w:t>
-      </w:r>
-      <w:r>
-        <w:t xml:space="preserve"> </w:t>
-      </w:r>
-      <w:r>
-        <w:t xml:space="preserve">fortsätter som linje V.</w:t>
+        <w:t xml:space="preserve">Robusthet:</w:t>
+      </w:r>
+      <w:r>
+        <w:t xml:space="preserve"> </w:t>
+      </w:r>
+      <w:r>
+        <w:t xml:space="preserve">börja med den robusta varianten av 1b, 15 av 20 turer, tills körtiderna kring Ö:s</w:t>
+      </w:r>
+      <w:r>
+        <w:t xml:space="preserve"> </w:t>
+      </w:r>
+      <w:r>
+        <w:t xml:space="preserve">skolturer har stämts av mot verkliga körtider.</w:t>
       </w:r>
     </w:p>
     <w:p>
@@ -4361,25 +4602,13 @@
           <w:b/>
           <w:bCs/>
         </w:rPr>
-        <w:t xml:space="preserve">Linje N via Bo-Bil</w:t>
-      </w:r>
-      <w:r>
-        <w:t xml:space="preserve"> </w:t>
-      </w:r>
-      <w:r>
-        <w:t xml:space="preserve">rekommenderas. Förslaget är körtidsneutralt men ger jämnare körtid och fler</w:t>
-      </w:r>
-      <w:r>
-        <w:t xml:space="preserve"> </w:t>
-      </w:r>
-      <w:r>
-        <w:t xml:space="preserve">avgångar vid Bo-Bil. Förlusten vid Vikingagränd (23 invånare) bör vägas in, och den kan mildras med</w:t>
-      </w:r>
-      <w:r>
-        <w:t xml:space="preserve"> </w:t>
-      </w:r>
-      <w:r>
-        <w:t xml:space="preserve">hållplatsen N3 söder om Maxinge från kapitel 3.</w:t>
+        <w:t xml:space="preserve">N2 på linje Ö</w:t>
+      </w:r>
+      <w:r>
+        <w:t xml:space="preserve"> </w:t>
+      </w:r>
+      <w:r>
+        <w:t xml:space="preserve">rekommenderas och ryms med alla turer.</w:t>
       </w:r>
     </w:p>
     <w:p>
@@ -4395,19 +4624,53 @@
           <w:b/>
           <w:bCs/>
         </w:rPr>
+        <w:t xml:space="preserve">Linje N via Bo-Bil</w:t>
+      </w:r>
+      <w:r>
+        <w:t xml:space="preserve"> </w:t>
+      </w:r>
+      <w:r>
+        <w:t xml:space="preserve">rekommenderas. Förslaget är körtidsneutralt men ger jämnare körtid och fler</w:t>
+      </w:r>
+      <w:r>
+        <w:t xml:space="preserve"> </w:t>
+      </w:r>
+      <w:r>
+        <w:t xml:space="preserve">avgångar vid Bo-Bil. Förlusten vid Vikingagränd (23 invånare) bör vägas in, och den kan mildras med</w:t>
+      </w:r>
+      <w:r>
+        <w:t xml:space="preserve"> </w:t>
+      </w:r>
+      <w:r>
+        <w:t xml:space="preserve">hållplatsen N3 söder om Maxinge från kapitel 3.</w:t>
+      </w:r>
+    </w:p>
+    <w:p>
+      <w:pPr>
+        <w:pStyle w:val="Compact"/>
+        <w:numPr>
+          <w:ilvl w:val="0"/>
+          <w:numId w:val="1016"/>
+        </w:numPr>
+      </w:pPr>
+      <w:r>
+        <w:rPr>
+          <w:b/>
+          <w:bCs/>
+        </w:rPr>
         <w:t xml:space="preserve">Paket A</w:t>
       </w:r>
       <w:r>
         <w:t xml:space="preserve"> </w:t>
       </w:r>
       <w:r>
-        <w:t xml:space="preserve">ger 278 invånare bättre tillgänglighet, med fem bussar och oförändrad driftkostnad (+2 000</w:t>
-      </w:r>
-      <w:r>
-        <w:t xml:space="preserve"> </w:t>
-      </w:r>
-      <w:r>
-        <w:t xml:space="preserve">euro per år) utöver investeringar i två hållplatser och vägförlängningen.</w:t>
+        <w:t xml:space="preserve">ger 278 invånare bättre tillgänglighet, med fem bussar och praktiskt taget oförändrad driftkostnad (cirka</w:t>
+      </w:r>
+      <w:r>
+        <w:t xml:space="preserve"> </w:t>
+      </w:r>
+      <w:r>
+        <w:t xml:space="preserve">+2 300 euro per år) utöver investeringar i två hållplatser och vägförlängningen.</w:t>
       </w:r>
     </w:p>
     <w:bookmarkEnd w:id="55"/>
@@ -4439,13 +4702,13 @@
         <w:t xml:space="preserve"> </w:t>
       </w:r>
       <w:r>
-        <w:t xml:space="preserve">är härledda ur tidtabellen. Förarnas raster och operatörens faktiska omloppsplaner ingår inte</w:t>
-      </w:r>
-      <w:r>
-        <w:t xml:space="preserve"> </w:t>
-      </w:r>
-      <w:r>
-        <w:t xml:space="preserve">och behöver stämmas av.</w:t>
+        <w:t xml:space="preserve">är härledda ur tidtabellen med beställarens norm för linjebyten (S ↔ N, Ö ↔ V). Förarnas raster</w:t>
+      </w:r>
+      <w:r>
+        <w:t xml:space="preserve"> </w:t>
+      </w:r>
+      <w:r>
+        <w:t xml:space="preserve">och operatörens faktiska omloppsplaner ingår inte och behöver stämmas av.</w:t>
       </w:r>
     </w:p>
     <w:p>
@@ -4495,19 +4758,40 @@
           <w:b/>
           <w:bCs/>
         </w:rPr>
-        <w:t xml:space="preserve">Hållplatslägena</w:t>
-      </w:r>
-      <w:r>
-        <w:t xml:space="preserve"> </w:t>
-      </w:r>
-      <w:r>
-        <w:t xml:space="preserve">för Möckelö Strand och N2 är indikativa. Befolkningen är jämnt fördelad inom varje</w:t>
-      </w:r>
-      <w:r>
-        <w:t xml:space="preserve"> </w:t>
-      </w:r>
-      <w:r>
-        <w:t xml:space="preserve">1 km-ruta, så antalet invånare som får täckning beror på det exakta läget.</w:t>
+        <w:t xml:space="preserve">Vägdragningen</w:t>
+      </w:r>
+      <w:r>
+        <w:t xml:space="preserve"> </w:t>
+      </w:r>
+      <w:r>
+        <w:t xml:space="preserve">längs gatunätet (OSRM) kunde inte hämtas i analysmiljön, så linjerna är ritade som raka</w:t>
+      </w:r>
+      <w:r>
+        <w:t xml:space="preserve"> </w:t>
+      </w:r>
+      <w:r>
+        <w:t xml:space="preserve">streck. När</w:t>
+      </w:r>
+      <w:r>
+        <w:t xml:space="preserve"> </w:t>
+      </w:r>
+      <w:r>
+        <w:rPr>
+          <w:rStyle w:val="VerbatimChar"/>
+        </w:rPr>
+        <w:t xml:space="preserve">python src/kor_alla.py</w:t>
+      </w:r>
+      <w:r>
+        <w:t xml:space="preserve"> </w:t>
+      </w:r>
+      <w:r>
+        <w:t xml:space="preserve">körs med nätåtkomst ruttas både dagens linjer och förslagens nya</w:t>
+      </w:r>
+      <w:r>
+        <w:t xml:space="preserve"> </w:t>
+      </w:r>
+      <w:r>
+        <w:t xml:space="preserve">delsträckor. OSRM:s körtider för de nya delsträckorna redovisas då för kontroll.</w:t>
       </w:r>
     </w:p>
     <w:p>
@@ -4523,13 +4807,19 @@
           <w:b/>
           <w:bCs/>
         </w:rPr>
-        <w:t xml:space="preserve">Påstigande och resenärseffekter</w:t>
-      </w:r>
-      <w:r>
-        <w:t xml:space="preserve"> </w:t>
-      </w:r>
-      <w:r>
-        <w:t xml:space="preserve">bygger på sommardata och bör räknas om med terminsdata.</w:t>
+        <w:t xml:space="preserve">Hållplatslägena</w:t>
+      </w:r>
+      <w:r>
+        <w:t xml:space="preserve"> </w:t>
+      </w:r>
+      <w:r>
+        <w:t xml:space="preserve">för Möckelö Strand och N2 är indikativa. Befolkningen är jämnt fördelad inom varje</w:t>
+      </w:r>
+      <w:r>
+        <w:t xml:space="preserve"> </w:t>
+      </w:r>
+      <w:r>
+        <w:t xml:space="preserve">1 km-ruta, så antalet invånare som får täckning beror på det exakta läget.</w:t>
       </w:r>
     </w:p>
     <w:p>
@@ -4545,13 +4835,13 @@
           <w:b/>
           <w:bCs/>
         </w:rPr>
-        <w:t xml:space="preserve">Enhetskostnaderna</w:t>
-      </w:r>
-      <w:r>
-        <w:t xml:space="preserve"> </w:t>
-      </w:r>
-      <w:r>
-        <w:t xml:space="preserve">är schablonvärden och bör ersättas med avtalspriser.</w:t>
+        <w:t xml:space="preserve">Påstigande och resenärseffekter</w:t>
+      </w:r>
+      <w:r>
+        <w:t xml:space="preserve"> </w:t>
+      </w:r>
+      <w:r>
+        <w:t xml:space="preserve">bygger på sommardata och bör räknas om med terminsdata.</w:t>
       </w:r>
     </w:p>
     <w:p>
@@ -4567,19 +4857,41 @@
           <w:b/>
           <w:bCs/>
         </w:rPr>
+        <w:t xml:space="preserve">Enhetskostnaderna</w:t>
+      </w:r>
+      <w:r>
+        <w:t xml:space="preserve"> </w:t>
+      </w:r>
+      <w:r>
+        <w:t xml:space="preserve">är schablonvärden och bör ersättas med avtalspriser.</w:t>
+      </w:r>
+    </w:p>
+    <w:p>
+      <w:pPr>
+        <w:pStyle w:val="Compact"/>
+        <w:numPr>
+          <w:ilvl w:val="0"/>
+          <w:numId w:val="1017"/>
+        </w:numPr>
+      </w:pPr>
+      <w:r>
+        <w:rPr>
+          <w:b/>
+          <w:bCs/>
+        </w:rPr>
         <w:t xml:space="preserve">Fortsatt arbete:</w:t>
       </w:r>
       <w:r>
         <w:t xml:space="preserve"> </w:t>
       </w:r>
       <w:r>
-        <w:t xml:space="preserve">pröva genomgående N/S för områdena kring linje N (Lillåkersvägen och Örtvägen) och</w:t>
-      </w:r>
-      <w:r>
-        <w:t xml:space="preserve"> </w:t>
-      </w:r>
-      <w:r>
-        <w:t xml:space="preserve">en omläggning av linje N och Ö i nordost.</w:t>
+        <w:t xml:space="preserve">pröva reglering vid bytet N → S för områdena kring linje N (Lillåkersvägen och</w:t>
+      </w:r>
+      <w:r>
+        <w:t xml:space="preserve"> </w:t>
+      </w:r>
+      <w:r>
+        <w:t xml:space="preserve">Örtvägen) och en omläggning av linje N och Ö i nordost.</w:t>
       </w:r>
     </w:p>
     <w:bookmarkEnd w:id="56"/>
@@ -4732,7 +5044,7 @@
               <w:pStyle w:val="Compact"/>
             </w:pPr>
             <w:r>
-              <w:t xml:space="preserve">Nya och ändrade hållplatser, linjer i paketet (bl.a. genomgående V/Ö), förändrad tillgänglighet</w:t>
+              <w:t xml:space="preserve">Nya och ändrade hållplatser, linjer i paketet, förändrad tillgänglighet</w:t>
             </w:r>
           </w:p>
         </w:tc>
@@ -4756,7 +5068,7 @@
               <w:pStyle w:val="Compact"/>
             </w:pPr>
             <w:r>
-              <w:t xml:space="preserve">Ny hållplats, schematisk körväg, linjen efter förslaget, förändrad tillgänglighet</w:t>
+              <w:t xml:space="preserve">Ny hållplats, körväg, linjen efter förslaget, förändrad tillgänglighet</w:t>
             </w:r>
           </w:p>
         </w:tc>
@@ -4809,7 +5121,54 @@
           </w:p>
         </w:tc>
       </w:tr>
+      <w:tr>
+        <w:tc>
+          <w:tcPr/>
+          <w:p>
+            <w:pPr>
+              <w:pStyle w:val="Compact"/>
+            </w:pPr>
+            <w:r>
+              <w:t xml:space="preserve">Bakgrund</w:t>
+            </w:r>
+          </w:p>
+        </w:tc>
+        <w:tc>
+          <w:tcPr/>
+          <w:p>
+            <w:pPr>
+              <w:pStyle w:val="Compact"/>
+            </w:pPr>
+            <w:r>
+              <w:t xml:space="preserve">Stadslinjerna i dag med vägdragning (förskjutna där de delar gata), hållplatser, befolkningsrutor, land</w:t>
+            </w:r>
+          </w:p>
+        </w:tc>
+      </w:tr>
     </w:tbl>
+    <w:p>
+      <w:pPr>
+        <w:pStyle w:val="BodyText"/>
+      </w:pPr>
+      <w:r>
+        <w:t xml:space="preserve">Vägdragningen i lagren följer gatunätet när den har hämtats från OSRM, annars raka streck. Fältet</w:t>
+      </w:r>
+      <w:r>
+        <w:t xml:space="preserve"> </w:t>
+      </w:r>
+      <w:r>
+        <w:rPr>
+          <w:rStyle w:val="VerbatimChar"/>
+        </w:rPr>
+        <w:t xml:space="preserve">vagdragning</w:t>
+      </w:r>
+      <w:r>
+        <w:t xml:space="preserve"> </w:t>
+      </w:r>
+      <w:r>
+        <w:t xml:space="preserve">anger vilket.</w:t>
+      </w:r>
+    </w:p>
     <w:bookmarkEnd w:id="57"/>
     <w:bookmarkEnd w:id="58"/>
     <w:sectPr>

</xml_diff>

<commit_message>
QGIS-skript som ruttar linjerna med OSRM och uppdaterar GIS-lagren
- output/gis/rutta_med_osrm.py: körs i QGIS Python-konsol, ruttar varje
  hållplatssegment (00_segment) med OSRM via QGIS nätverksinställningar och
  uppdaterar 00_stadslinjer, 00_stadslinjer_forskjutna (spåranalysen
  portad till ren Python), b4_linjer_forslag och b4_forslag_korvagar.
  Planerad väg (1b, Norrgårdsvägen) behålls schematisk.
- GIS-exporten innehåller nu 00_segment (med lon/lat), 00_linjekedjor
  och förslagslinjer med en del per hållplatssegment.
- s01_vagdragning.py --fran-gis för över QGIS-ruttningen till analyskedjan.
- LASMIG, PM-bilaga, laddningsskript och PROGRESS uppdaterade.

Co-Authored-By: Claude Opus 5.5 <noreply@anthropic.com>
Claude-Session: https://claude.ai/code/session_01WLHtAWyi9yj91UnyPCG2J5
</commit_message>
<xml_diff>
--- a/rapport/PM_linjeforslag.docx
+++ b/rapport/PM_linjeforslag.docx
@@ -5151,7 +5151,7 @@
         <w:pStyle w:val="BodyText"/>
       </w:pPr>
       <w:r>
-        <w:t xml:space="preserve">Vägdragningen i lagren följer gatunätet när den har hämtats från OSRM, annars raka streck. Fältet</w:t>
+        <w:t xml:space="preserve">Linjerna levereras som raka streck. Vägdragningen längs gatunätet hämtas genom att köra</w:t>
       </w:r>
       <w:r>
         <w:t xml:space="preserve"> </w:t>
@@ -5160,13 +5160,56 @@
         <w:rPr>
           <w:rStyle w:val="VerbatimChar"/>
         </w:rPr>
+        <w:t xml:space="preserve">output/gis/rutta_med_osrm.py</w:t>
+      </w:r>
+      <w:r>
+        <w:t xml:space="preserve"> </w:t>
+      </w:r>
+      <w:r>
+        <w:t xml:space="preserve">i QGIS Python-konsol på en dator med internet. Skriptet ruttar varje</w:t>
+      </w:r>
+      <w:r>
+        <w:t xml:space="preserve"> </w:t>
+      </w:r>
+      <w:r>
+        <w:t xml:space="preserve">hållplatssegment med OSRM och uppdaterar linjerna i</w:t>
+      </w:r>
+      <w:r>
+        <w:t xml:space="preserve"> </w:t>
+      </w:r>
+      <w:r>
+        <w:rPr>
+          <w:i/>
+          <w:iCs/>
+        </w:rPr>
+        <w:t xml:space="preserve">Bakgrund</w:t>
+      </w:r>
+      <w:r>
+        <w:t xml:space="preserve"> </w:t>
+      </w:r>
+      <w:r>
+        <w:t xml:space="preserve">och i förslagsgrupperna, inklusive</w:t>
+      </w:r>
+      <w:r>
+        <w:t xml:space="preserve"> </w:t>
+      </w:r>
+      <w:r>
+        <w:t xml:space="preserve">förskjutningen där linjer delar gata. Fältet</w:t>
+      </w:r>
+      <w:r>
+        <w:t xml:space="preserve"> </w:t>
+      </w:r>
+      <w:r>
+        <w:rPr>
+          <w:rStyle w:val="VerbatimChar"/>
+        </w:rPr>
         <w:t xml:space="preserve">vagdragning</w:t>
       </w:r>
       <w:r>
         <w:t xml:space="preserve"> </w:t>
       </w:r>
       <w:r>
-        <w:t xml:space="preserve">anger vilket.</w:t>
+        <w:t xml:space="preserve">anger om en linje är ruttad.</w:t>
       </w:r>
     </w:p>
     <w:bookmarkEnd w:id="57"/>

</xml_diff>